<commit_message>
đã update xong tempalte hợp đồng hồ sơ gỗ
</commit_message>
<xml_diff>
--- a/my_custom_addons/dl_wood_traceability/static/TEMPLATES/TEMPLATE_HD_HSG.docx
+++ b/my_custom_addons/dl_wood_traceability/static/TEMPLATES/TEMPLATE_HD_HSG.docx
@@ -51,20 +51,54 @@
       <w:pPr>
         <w:spacing w:line="276" w:lineRule="auto"/>
         <w:jc w:val="center"/>
-      </w:pPr>
-      <w:r>
-        <w:br/>
-      </w:r>
-      <w:r>
         <w:rPr>
           <w:b/>
           <w:bCs/>
           <w:sz w:val="32"/>
           <w:szCs w:val="32"/>
         </w:rPr>
+      </w:pPr>
+      <w:r>
+        <w:br/>
+      </w:r>
+      <w:r>
+        <w:rPr>
+          <w:b/>
+          <w:bCs/>
+          <w:sz w:val="32"/>
+          <w:szCs w:val="32"/>
+        </w:rPr>
         <w:t>HỢP ĐỒNG MUA BÁN</w:t>
       </w:r>
-      <w:r>
+    </w:p>
+    <w:p>
+      <w:pPr>
+        <w:spacing w:line="276" w:lineRule="auto"/>
+        <w:jc w:val="center"/>
+        <w:rPr>
+          <w:sz w:val="26"/>
+          <w:szCs w:val="26"/>
+        </w:rPr>
+      </w:pPr>
+      <w:r>
+        <w:rPr>
+          <w:sz w:val="26"/>
+          <w:szCs w:val="26"/>
+        </w:rPr>
+        <w:t xml:space="preserve">Số: </w:t>
+      </w:r>
+      <w:r>
+        <w:rPr>
+          <w:sz w:val="26"/>
+          <w:szCs w:val="26"/>
+        </w:rPr>
+        <w:t>{{contract_number}}</w:t>
+      </w:r>
+      <w:r>
+        <w:rPr>
+          <w:sz w:val="26"/>
+          <w:szCs w:val="26"/>
+        </w:rPr>
         <w:br/>
       </w:r>
     </w:p>
@@ -121,7 +155,25 @@
           <w:sz w:val="26"/>
           <w:szCs w:val="26"/>
         </w:rPr>
-        <w:t>Hôm nay, ngày 27 tháng 04 năm 2026 chúng tôi gồm:</w:t>
+        <w:t xml:space="preserve">Hôm nay, </w:t>
+      </w:r>
+      <w:r>
+        <w:rPr>
+          <w:i/>
+          <w:iCs/>
+          <w:sz w:val="26"/>
+          <w:szCs w:val="26"/>
+        </w:rPr>
+        <w:t xml:space="preserve">{{vietnamese_x_contract_date}} </w:t>
+      </w:r>
+      <w:r>
+        <w:rPr>
+          <w:i/>
+          <w:iCs/>
+          <w:sz w:val="26"/>
+          <w:szCs w:val="26"/>
+        </w:rPr>
+        <w:t>chúng tôi gồm:</w:t>
       </w:r>
     </w:p>
     <w:p>
@@ -320,7 +372,21 @@
           <w:sz w:val="26"/>
           <w:szCs w:val="26"/>
         </w:rPr>
-        <w:t>{{owner_address}}</w:t>
+        <w:t>{{</w:t>
+      </w:r>
+      <w:r>
+        <w:rPr>
+          <w:sz w:val="26"/>
+          <w:szCs w:val="26"/>
+        </w:rPr>
+        <w:t>forest_</w:t>
+      </w:r>
+      <w:r>
+        <w:rPr>
+          <w:sz w:val="26"/>
+          <w:szCs w:val="26"/>
+        </w:rPr>
+        <w:t>owner_address}}</w:t>
       </w:r>
     </w:p>
     <w:p>
@@ -426,12 +492,12 @@
         <w:tblLook w:val="04A0" w:firstRow="1" w:lastRow="0" w:firstColumn="1" w:lastColumn="0" w:noHBand="0" w:noVBand="1"/>
       </w:tblPr>
       <w:tblGrid>
-        <w:gridCol w:w="1250"/>
-        <w:gridCol w:w="1876"/>
-        <w:gridCol w:w="1520"/>
-        <w:gridCol w:w="1446"/>
-        <w:gridCol w:w="3013"/>
-        <w:gridCol w:w="666"/>
+        <w:gridCol w:w="1321"/>
+        <w:gridCol w:w="2433"/>
+        <w:gridCol w:w="1393"/>
+        <w:gridCol w:w="1841"/>
+        <w:gridCol w:w="2084"/>
+        <w:gridCol w:w="699"/>
       </w:tblGrid>
       <w:tr>
         <w:trPr>
@@ -574,15 +640,17 @@
             <w:pPr>
               <w:spacing w:line="360" w:lineRule="auto"/>
               <w:jc w:val="center"/>
-            </w:pPr>
-            <w:r>
-              <w:t>{%</w:t>
-            </w:r>
-            <w:r>
-              <w:t>tr</w:t>
-            </w:r>
-            <w:r>
-              <w:t xml:space="preserve"> for row in table_rows %}</w:t>
+              <w:rPr>
+                <w:sz w:val="26"/>
+                <w:szCs w:val="26"/>
+              </w:rPr>
+            </w:pPr>
+            <w:r>
+              <w:rPr>
+                <w:sz w:val="26"/>
+                <w:szCs w:val="26"/>
+              </w:rPr>
+              <w:t>{%tr for row in table_rows %}</w:t>
             </w:r>
           </w:p>
         </w:tc>
@@ -595,6 +663,10 @@
             <w:pPr>
               <w:spacing w:line="360" w:lineRule="auto"/>
               <w:jc w:val="center"/>
+              <w:rPr>
+                <w:sz w:val="26"/>
+                <w:szCs w:val="26"/>
+              </w:rPr>
             </w:pPr>
           </w:p>
         </w:tc>
@@ -607,6 +679,10 @@
             <w:pPr>
               <w:spacing w:line="360" w:lineRule="auto"/>
               <w:jc w:val="center"/>
+              <w:rPr>
+                <w:sz w:val="26"/>
+                <w:szCs w:val="26"/>
+              </w:rPr>
             </w:pPr>
           </w:p>
         </w:tc>
@@ -619,6 +695,10 @@
             <w:pPr>
               <w:spacing w:line="360" w:lineRule="auto"/>
               <w:jc w:val="center"/>
+              <w:rPr>
+                <w:sz w:val="26"/>
+                <w:szCs w:val="26"/>
+              </w:rPr>
             </w:pPr>
           </w:p>
         </w:tc>
@@ -646,6 +726,10 @@
             <w:pPr>
               <w:spacing w:line="360" w:lineRule="auto"/>
               <w:jc w:val="center"/>
+              <w:rPr>
+                <w:sz w:val="26"/>
+                <w:szCs w:val="26"/>
+              </w:rPr>
             </w:pPr>
           </w:p>
         </w:tc>
@@ -660,8 +744,16 @@
             <w:pPr>
               <w:spacing w:line="360" w:lineRule="auto"/>
               <w:jc w:val="center"/>
-            </w:pPr>
-            <w:r>
+              <w:rPr>
+                <w:sz w:val="26"/>
+                <w:szCs w:val="26"/>
+              </w:rPr>
+            </w:pPr>
+            <w:r>
+              <w:rPr>
+                <w:sz w:val="26"/>
+                <w:szCs w:val="26"/>
+              </w:rPr>
               <w:t>{{row.idx}}</w:t>
             </w:r>
           </w:p>
@@ -675,14 +767,30 @@
             <w:pPr>
               <w:spacing w:line="360" w:lineRule="auto"/>
               <w:jc w:val="center"/>
-            </w:pPr>
-            <w:r>
+              <w:rPr>
+                <w:sz w:val="26"/>
+                <w:szCs w:val="26"/>
+              </w:rPr>
+            </w:pPr>
+            <w:r>
+              <w:rPr>
+                <w:sz w:val="26"/>
+                <w:szCs w:val="26"/>
+              </w:rPr>
               <w:t>{{</w:t>
             </w:r>
             <w:r>
+              <w:rPr>
+                <w:sz w:val="26"/>
+                <w:szCs w:val="26"/>
+              </w:rPr>
               <w:t>row.</w:t>
             </w:r>
             <w:r>
+              <w:rPr>
+                <w:sz w:val="26"/>
+                <w:szCs w:val="26"/>
+              </w:rPr>
               <w:t>species_name}}</w:t>
             </w:r>
           </w:p>
@@ -696,14 +804,30 @@
             <w:pPr>
               <w:spacing w:line="360" w:lineRule="auto"/>
               <w:jc w:val="center"/>
-            </w:pPr>
-            <w:r>
+              <w:rPr>
+                <w:sz w:val="26"/>
+                <w:szCs w:val="26"/>
+              </w:rPr>
+            </w:pPr>
+            <w:r>
+              <w:rPr>
+                <w:sz w:val="26"/>
+                <w:szCs w:val="26"/>
+              </w:rPr>
               <w:t>{{</w:t>
             </w:r>
             <w:r>
+              <w:rPr>
+                <w:sz w:val="26"/>
+                <w:szCs w:val="26"/>
+              </w:rPr>
               <w:t>row.</w:t>
             </w:r>
             <w:r>
+              <w:rPr>
+                <w:sz w:val="26"/>
+                <w:szCs w:val="26"/>
+              </w:rPr>
               <w:t>unit}}</w:t>
             </w:r>
           </w:p>
@@ -717,14 +841,30 @@
             <w:pPr>
               <w:spacing w:line="360" w:lineRule="auto"/>
               <w:jc w:val="center"/>
-            </w:pPr>
-            <w:r>
+              <w:rPr>
+                <w:sz w:val="26"/>
+                <w:szCs w:val="26"/>
+              </w:rPr>
+            </w:pPr>
+            <w:r>
+              <w:rPr>
+                <w:sz w:val="26"/>
+                <w:szCs w:val="26"/>
+              </w:rPr>
               <w:t>{{</w:t>
             </w:r>
             <w:r>
+              <w:rPr>
+                <w:sz w:val="26"/>
+                <w:szCs w:val="26"/>
+              </w:rPr>
               <w:t>row.</w:t>
             </w:r>
             <w:r>
+              <w:rPr>
+                <w:sz w:val="26"/>
+                <w:szCs w:val="26"/>
+              </w:rPr>
               <w:t>quantity}}</w:t>
             </w:r>
           </w:p>
@@ -737,6 +877,10 @@
             <w:pPr>
               <w:spacing w:line="360" w:lineRule="auto"/>
               <w:jc w:val="center"/>
+              <w:rPr>
+                <w:sz w:val="26"/>
+                <w:szCs w:val="26"/>
+              </w:rPr>
             </w:pPr>
             <w:r>
               <w:rPr>
@@ -756,6 +900,10 @@
             <w:pPr>
               <w:spacing w:line="360" w:lineRule="auto"/>
               <w:jc w:val="center"/>
+              <w:rPr>
+                <w:sz w:val="26"/>
+                <w:szCs w:val="26"/>
+              </w:rPr>
             </w:pPr>
           </w:p>
         </w:tc>
@@ -770,6 +918,10 @@
             <w:pPr>
               <w:spacing w:line="360" w:lineRule="auto"/>
               <w:jc w:val="center"/>
+              <w:rPr>
+                <w:sz w:val="26"/>
+                <w:szCs w:val="26"/>
+              </w:rPr>
             </w:pPr>
           </w:p>
         </w:tc>
@@ -782,6 +934,10 @@
             <w:pPr>
               <w:spacing w:line="360" w:lineRule="auto"/>
               <w:jc w:val="center"/>
+              <w:rPr>
+                <w:sz w:val="26"/>
+                <w:szCs w:val="26"/>
+              </w:rPr>
             </w:pPr>
           </w:p>
         </w:tc>
@@ -794,6 +950,10 @@
             <w:pPr>
               <w:spacing w:line="360" w:lineRule="auto"/>
               <w:jc w:val="center"/>
+              <w:rPr>
+                <w:sz w:val="26"/>
+                <w:szCs w:val="26"/>
+              </w:rPr>
             </w:pPr>
           </w:p>
         </w:tc>
@@ -806,6 +966,10 @@
             <w:pPr>
               <w:spacing w:line="360" w:lineRule="auto"/>
               <w:jc w:val="center"/>
+              <w:rPr>
+                <w:sz w:val="26"/>
+                <w:szCs w:val="26"/>
+              </w:rPr>
             </w:pPr>
           </w:p>
         </w:tc>
@@ -833,15 +997,17 @@
             <w:pPr>
               <w:spacing w:line="360" w:lineRule="auto"/>
               <w:jc w:val="center"/>
-            </w:pPr>
-            <w:r>
-              <w:t>{%</w:t>
-            </w:r>
-            <w:r>
-              <w:t xml:space="preserve">tr  </w:t>
-            </w:r>
-            <w:r>
-              <w:t>endfor %}</w:t>
+              <w:rPr>
+                <w:sz w:val="26"/>
+                <w:szCs w:val="26"/>
+              </w:rPr>
+            </w:pPr>
+            <w:r>
+              <w:rPr>
+                <w:sz w:val="26"/>
+                <w:szCs w:val="26"/>
+              </w:rPr>
+              <w:t>{%tr  endfor %}</w:t>
             </w:r>
           </w:p>
         </w:tc>
@@ -873,6 +1039,7 @@
           <w:sz w:val="26"/>
           <w:szCs w:val="26"/>
         </w:rPr>
+        <w:lastRenderedPageBreak/>
         <w:t>+ Gỗ tròn không rỗng ruột, không nhận ruột xốp to, sâu mọt, mục ải, không nhận gỗ non, gỗ cành ngọn, gỗ có độ bạnh vè quá lớn và gỗ có vanh nhỏ hơn 30 cm</w:t>
       </w:r>
     </w:p>
@@ -921,7 +1088,6 @@
           <w:sz w:val="26"/>
           <w:szCs w:val="26"/>
         </w:rPr>
-        <w:lastRenderedPageBreak/>
         <w:t>Gỗ bên bán phải đáp ứng các yêu cầu sau:</w:t>
       </w:r>
     </w:p>
@@ -1123,7 +1289,35 @@
           <w:sz w:val="26"/>
           <w:szCs w:val="26"/>
         </w:rPr>
-        <w:t>- Thời gian giao hàng từ ngày 04 tháng 05 năm 2026 đến ngày 16 tháng 05 năm 2026.</w:t>
+        <w:t xml:space="preserve">- Thời gian giao hàng từ </w:t>
+      </w:r>
+      <w:r>
+        <w:rPr>
+          <w:sz w:val="26"/>
+          <w:szCs w:val="26"/>
+        </w:rPr>
+        <w:t xml:space="preserve">{{vietnamese_x_delivery_start_date}} </w:t>
+      </w:r>
+      <w:r>
+        <w:rPr>
+          <w:sz w:val="26"/>
+          <w:szCs w:val="26"/>
+        </w:rPr>
+        <w:t xml:space="preserve">đến </w:t>
+      </w:r>
+      <w:r>
+        <w:rPr>
+          <w:sz w:val="26"/>
+          <w:szCs w:val="26"/>
+        </w:rPr>
+        <w:t>{{vietnamese_x_delivery_start_date}}</w:t>
+      </w:r>
+      <w:r>
+        <w:rPr>
+          <w:sz w:val="26"/>
+          <w:szCs w:val="26"/>
+        </w:rPr>
+        <w:t>.</w:t>
       </w:r>
     </w:p>
     <w:p>
@@ -1243,6 +1437,7 @@
           <w:sz w:val="26"/>
           <w:szCs w:val="26"/>
         </w:rPr>
+        <w:lastRenderedPageBreak/>
         <w:t>Hai bên cam kết thực hiện nghiêm chỉnh theo các điều khoản trong hợp đồng. Trong quá trình thực hiện hợp đồng nếu có tranh chấp xảy ra thì một trong hai bên phải báo cho bên kia trước 15 ngày để cùng bàn bạc giải quyết bằng thương lượng, hòa giải.</w:t>
       </w:r>
     </w:p>
@@ -1305,7 +1500,6 @@
                 <w:sz w:val="26"/>
                 <w:szCs w:val="26"/>
               </w:rPr>
-              <w:lastRenderedPageBreak/>
               <w:t>ĐẠI DIỆN BÊN BÁN</w:t>
             </w:r>
           </w:p>
@@ -1424,16 +1618,8 @@
           <w:sz w:val="26"/>
           <w:szCs w:val="26"/>
         </w:rPr>
-        <w:t>Số: 27/04/2026 XH_LVB</w:t>
-      </w:r>
-      <w:r>
-        <w:br/>
-      </w:r>
-    </w:p>
-    <w:p>
-      <w:pPr>
-        <w:spacing w:line="360" w:lineRule="auto"/>
-      </w:pPr>
+        <w:t xml:space="preserve">Số: </w:t>
+      </w:r>
       <w:r>
         <w:rPr>
           <w:i/>
@@ -1441,7 +1627,10 @@
           <w:sz w:val="26"/>
           <w:szCs w:val="26"/>
         </w:rPr>
-        <w:t>Căn cứ Bộ Luật dân sự nước CHXHCNVN số 91/2015/QH13 ngày 24/11/2015.</w:t>
+        <w:t>{{x_addendum_num}}</w:t>
+      </w:r>
+      <w:r>
+        <w:br/>
       </w:r>
     </w:p>
     <w:p>
@@ -1455,7 +1644,7 @@
           <w:sz w:val="26"/>
           <w:szCs w:val="26"/>
         </w:rPr>
-        <w:t>Căn cứ Luật Thương mại của nước CHXHCNVN số 36/2005 - QH 11 ngày 14/6/2005.</w:t>
+        <w:t>Căn cứ Bộ Luật dân sự nước CHXHCNVN số 91/2015/QH13 ngày 24/11/2015.</w:t>
       </w:r>
     </w:p>
     <w:p>
@@ -1469,8 +1658,13 @@
           <w:sz w:val="26"/>
           <w:szCs w:val="26"/>
         </w:rPr>
-        <w:t xml:space="preserve">Căn cứ vào hợp đồng mua bán </w:t>
-      </w:r>
+        <w:t>Căn cứ Luật Thương mại của nước CHXHCNVN số 36/2005 - QH 11 ngày 14/6/2005.</w:t>
+      </w:r>
+    </w:p>
+    <w:p>
+      <w:pPr>
+        <w:spacing w:line="360" w:lineRule="auto"/>
+      </w:pPr>
       <w:r>
         <w:rPr>
           <w:i/>
@@ -1478,7 +1672,7 @@
           <w:sz w:val="26"/>
           <w:szCs w:val="26"/>
         </w:rPr>
-        <w:t xml:space="preserve">{{date_of_hd}} </w:t>
+        <w:t>Căn cứ vào hợp đồng mua bán</w:t>
       </w:r>
       <w:r>
         <w:rPr>
@@ -1487,7 +1681,14 @@
           <w:sz w:val="26"/>
           <w:szCs w:val="26"/>
         </w:rPr>
-        <w:t xml:space="preserve">giữa </w:t>
+        <w:t xml:space="preserve"> số </w:t>
+      </w:r>
+      <w:r>
+        <w:rPr>
+          <w:sz w:val="26"/>
+          <w:szCs w:val="26"/>
+        </w:rPr>
+        <w:t>{{contract_number}}</w:t>
       </w:r>
       <w:r>
         <w:rPr>
@@ -1496,7 +1697,7 @@
           <w:sz w:val="26"/>
           <w:szCs w:val="26"/>
         </w:rPr>
-        <w:t xml:space="preserve">{{company_name}} </w:t>
+        <w:t xml:space="preserve"> </w:t>
       </w:r>
       <w:r>
         <w:rPr>
@@ -1505,7 +1706,7 @@
           <w:sz w:val="26"/>
           <w:szCs w:val="26"/>
         </w:rPr>
-        <w:t xml:space="preserve">và ông(bà): </w:t>
+        <w:t xml:space="preserve">{{date_of_hd}} </w:t>
       </w:r>
       <w:r>
         <w:rPr>
@@ -1514,13 +1715,8 @@
           <w:sz w:val="26"/>
           <w:szCs w:val="26"/>
         </w:rPr>
-        <w:t>{{owner_name}}</w:t>
-      </w:r>
-    </w:p>
-    <w:p>
-      <w:pPr>
-        <w:spacing w:line="360" w:lineRule="auto"/>
-      </w:pPr>
+        <w:t xml:space="preserve">giữa </w:t>
+      </w:r>
       <w:r>
         <w:rPr>
           <w:i/>
@@ -1528,13 +1724,8 @@
           <w:sz w:val="26"/>
           <w:szCs w:val="26"/>
         </w:rPr>
-        <w:t>Căn cứ vào khả năng và nhu cầu của hai bên.</w:t>
-      </w:r>
-    </w:p>
-    <w:p>
-      <w:pPr>
-        <w:spacing w:line="360" w:lineRule="auto"/>
-      </w:pPr>
+        <w:t xml:space="preserve">{{company_name}} </w:t>
+      </w:r>
       <w:r>
         <w:rPr>
           <w:i/>
@@ -1542,7 +1733,7 @@
           <w:sz w:val="26"/>
           <w:szCs w:val="26"/>
         </w:rPr>
-        <w:t xml:space="preserve">Hôm nay, </w:t>
+        <w:t xml:space="preserve">và ông(bà): </w:t>
       </w:r>
       <w:r>
         <w:rPr>
@@ -1551,7 +1742,44 @@
           <w:sz w:val="26"/>
           <w:szCs w:val="26"/>
         </w:rPr>
-        <w:t>{{date_of_hd}}</w:t>
+        <w:t>{{owner_name}}</w:t>
+      </w:r>
+    </w:p>
+    <w:p>
+      <w:pPr>
+        <w:spacing w:line="360" w:lineRule="auto"/>
+      </w:pPr>
+      <w:r>
+        <w:rPr>
+          <w:i/>
+          <w:iCs/>
+          <w:sz w:val="26"/>
+          <w:szCs w:val="26"/>
+        </w:rPr>
+        <w:t>Căn cứ vào khả năng và nhu cầu của hai bên.</w:t>
+      </w:r>
+    </w:p>
+    <w:p>
+      <w:pPr>
+        <w:spacing w:line="360" w:lineRule="auto"/>
+      </w:pPr>
+      <w:r>
+        <w:rPr>
+          <w:i/>
+          <w:iCs/>
+          <w:sz w:val="26"/>
+          <w:szCs w:val="26"/>
+        </w:rPr>
+        <w:t xml:space="preserve">Hôm nay, </w:t>
+      </w:r>
+      <w:r>
+        <w:rPr>
+          <w:i/>
+          <w:iCs/>
+          <w:sz w:val="26"/>
+          <w:szCs w:val="26"/>
+        </w:rPr>
+        <w:t>, {{vietnamese_x_contract_date}}</w:t>
       </w:r>
       <w:r>
         <w:rPr>
@@ -1867,13 +2095,13 @@
         <w:tblLook w:val="04A0" w:firstRow="1" w:lastRow="0" w:firstColumn="1" w:lastColumn="0" w:noHBand="0" w:noVBand="1"/>
       </w:tblPr>
       <w:tblGrid>
-        <w:gridCol w:w="1001"/>
-        <w:gridCol w:w="1839"/>
-        <w:gridCol w:w="1484"/>
-        <w:gridCol w:w="1055"/>
-        <w:gridCol w:w="2001"/>
-        <w:gridCol w:w="1860"/>
-        <w:gridCol w:w="531"/>
+        <w:gridCol w:w="1049"/>
+        <w:gridCol w:w="1929"/>
+        <w:gridCol w:w="1558"/>
+        <w:gridCol w:w="1106"/>
+        <w:gridCol w:w="1620"/>
+        <w:gridCol w:w="1952"/>
+        <w:gridCol w:w="557"/>
       </w:tblGrid>
       <w:tr>
         <w:tc>
@@ -2133,11 +2361,23 @@
             <w:pPr>
               <w:spacing w:line="360" w:lineRule="auto"/>
               <w:jc w:val="center"/>
-            </w:pPr>
-            <w:r>
+              <w:rPr>
+                <w:sz w:val="26"/>
+                <w:szCs w:val="26"/>
+              </w:rPr>
+            </w:pPr>
+            <w:r>
+              <w:rPr>
+                <w:sz w:val="26"/>
+                <w:szCs w:val="26"/>
+              </w:rPr>
               <w:t>{{</w:t>
             </w:r>
             <w:r>
+              <w:rPr>
+                <w:sz w:val="26"/>
+                <w:szCs w:val="26"/>
+              </w:rPr>
               <w:t>row.idx}}</w:t>
             </w:r>
           </w:p>
@@ -2151,8 +2391,16 @@
             <w:pPr>
               <w:spacing w:line="360" w:lineRule="auto"/>
               <w:jc w:val="center"/>
-            </w:pPr>
-            <w:r>
+              <w:rPr>
+                <w:sz w:val="26"/>
+                <w:szCs w:val="26"/>
+              </w:rPr>
+            </w:pPr>
+            <w:r>
+              <w:rPr>
+                <w:sz w:val="26"/>
+                <w:szCs w:val="26"/>
+              </w:rPr>
               <w:t>{{row.species_name}}</w:t>
             </w:r>
           </w:p>
@@ -2166,8 +2414,16 @@
             <w:pPr>
               <w:spacing w:line="360" w:lineRule="auto"/>
               <w:jc w:val="center"/>
-            </w:pPr>
-            <w:r>
+              <w:rPr>
+                <w:sz w:val="26"/>
+                <w:szCs w:val="26"/>
+              </w:rPr>
+            </w:pPr>
+            <w:r>
+              <w:rPr>
+                <w:sz w:val="26"/>
+                <w:szCs w:val="26"/>
+              </w:rPr>
               <w:t>{{row.quantity}}</w:t>
             </w:r>
           </w:p>
@@ -2181,8 +2437,16 @@
             <w:pPr>
               <w:spacing w:line="360" w:lineRule="auto"/>
               <w:jc w:val="center"/>
-            </w:pPr>
-            <w:r>
+              <w:rPr>
+                <w:sz w:val="26"/>
+                <w:szCs w:val="26"/>
+              </w:rPr>
+            </w:pPr>
+            <w:r>
+              <w:rPr>
+                <w:sz w:val="26"/>
+                <w:szCs w:val="26"/>
+              </w:rPr>
               <w:t>{{row.unit}}</w:t>
             </w:r>
           </w:p>
@@ -2196,6 +2460,10 @@
             <w:pPr>
               <w:spacing w:line="360" w:lineRule="auto"/>
               <w:jc w:val="center"/>
+              <w:rPr>
+                <w:sz w:val="26"/>
+                <w:szCs w:val="26"/>
+              </w:rPr>
             </w:pPr>
             <w:r>
               <w:rPr>
@@ -2215,8 +2483,16 @@
             <w:pPr>
               <w:spacing w:line="360" w:lineRule="auto"/>
               <w:jc w:val="center"/>
-            </w:pPr>
-            <w:r>
+              <w:rPr>
+                <w:sz w:val="26"/>
+                <w:szCs w:val="26"/>
+              </w:rPr>
+            </w:pPr>
+            <w:r>
+              <w:rPr>
+                <w:sz w:val="26"/>
+                <w:szCs w:val="26"/>
+              </w:rPr>
               <w:t>{{row.price_subtotal}}</w:t>
             </w:r>
           </w:p>
@@ -2230,6 +2506,10 @@
             <w:pPr>
               <w:spacing w:line="360" w:lineRule="auto"/>
               <w:jc w:val="center"/>
+              <w:rPr>
+                <w:sz w:val="26"/>
+                <w:szCs w:val="26"/>
+              </w:rPr>
             </w:pPr>
           </w:p>
         </w:tc>
@@ -2244,6 +2524,10 @@
             <w:pPr>
               <w:spacing w:line="360" w:lineRule="auto"/>
               <w:jc w:val="center"/>
+              <w:rPr>
+                <w:sz w:val="26"/>
+                <w:szCs w:val="26"/>
+              </w:rPr>
             </w:pPr>
           </w:p>
         </w:tc>
@@ -2256,6 +2540,10 @@
             <w:pPr>
               <w:spacing w:line="360" w:lineRule="auto"/>
               <w:jc w:val="center"/>
+              <w:rPr>
+                <w:sz w:val="26"/>
+                <w:szCs w:val="26"/>
+              </w:rPr>
             </w:pPr>
           </w:p>
         </w:tc>
@@ -2268,6 +2556,10 @@
             <w:pPr>
               <w:spacing w:line="360" w:lineRule="auto"/>
               <w:jc w:val="center"/>
+              <w:rPr>
+                <w:sz w:val="26"/>
+                <w:szCs w:val="26"/>
+              </w:rPr>
             </w:pPr>
           </w:p>
         </w:tc>
@@ -2280,6 +2572,10 @@
             <w:pPr>
               <w:spacing w:line="360" w:lineRule="auto"/>
               <w:jc w:val="center"/>
+              <w:rPr>
+                <w:sz w:val="26"/>
+                <w:szCs w:val="26"/>
+              </w:rPr>
             </w:pPr>
           </w:p>
         </w:tc>
@@ -2308,6 +2604,10 @@
             <w:pPr>
               <w:spacing w:line="360" w:lineRule="auto"/>
               <w:jc w:val="center"/>
+              <w:rPr>
+                <w:sz w:val="26"/>
+                <w:szCs w:val="26"/>
+              </w:rPr>
             </w:pPr>
           </w:p>
         </w:tc>
@@ -2320,15 +2620,17 @@
             <w:pPr>
               <w:spacing w:line="360" w:lineRule="auto"/>
               <w:jc w:val="center"/>
-            </w:pPr>
-            <w:r>
-              <w:t>{%</w:t>
-            </w:r>
-            <w:r>
-              <w:t>tr</w:t>
-            </w:r>
-            <w:r>
-              <w:t xml:space="preserve"> endfor %}</w:t>
+              <w:rPr>
+                <w:sz w:val="26"/>
+                <w:szCs w:val="26"/>
+              </w:rPr>
+            </w:pPr>
+            <w:r>
+              <w:rPr>
+                <w:sz w:val="26"/>
+                <w:szCs w:val="26"/>
+              </w:rPr>
+              <w:t>{%tr endfor %}</w:t>
             </w:r>
           </w:p>
         </w:tc>
@@ -2353,6 +2655,10 @@
             <w:pPr>
               <w:spacing w:line="360" w:lineRule="auto"/>
               <w:jc w:val="center"/>
+              <w:rPr>
+                <w:sz w:val="26"/>
+                <w:szCs w:val="26"/>
+              </w:rPr>
             </w:pPr>
             <w:r>
               <w:rPr>
@@ -2373,8 +2679,16 @@
             <w:pPr>
               <w:spacing w:line="360" w:lineRule="auto"/>
               <w:jc w:val="center"/>
-            </w:pPr>
-            <w:r>
+              <w:rPr>
+                <w:sz w:val="26"/>
+                <w:szCs w:val="26"/>
+              </w:rPr>
+            </w:pPr>
+            <w:r>
+              <w:rPr>
+                <w:sz w:val="26"/>
+                <w:szCs w:val="26"/>
+              </w:rPr>
               <w:t>{{total_quantity}}</w:t>
             </w:r>
           </w:p>
@@ -2387,6 +2701,10 @@
             <w:pPr>
               <w:spacing w:line="360" w:lineRule="auto"/>
               <w:jc w:val="center"/>
+              <w:rPr>
+                <w:sz w:val="26"/>
+                <w:szCs w:val="26"/>
+              </w:rPr>
             </w:pPr>
           </w:p>
         </w:tc>
@@ -2398,6 +2716,10 @@
             <w:pPr>
               <w:spacing w:line="360" w:lineRule="auto"/>
               <w:jc w:val="center"/>
+              <w:rPr>
+                <w:sz w:val="26"/>
+                <w:szCs w:val="26"/>
+              </w:rPr>
             </w:pPr>
           </w:p>
         </w:tc>
@@ -2409,6 +2731,10 @@
             <w:pPr>
               <w:spacing w:line="360" w:lineRule="auto"/>
               <w:jc w:val="center"/>
+              <w:rPr>
+                <w:sz w:val="26"/>
+                <w:szCs w:val="26"/>
+              </w:rPr>
             </w:pPr>
             <w:r>
               <w:rPr>
@@ -2429,6 +2755,10 @@
             <w:pPr>
               <w:spacing w:line="360" w:lineRule="auto"/>
               <w:jc w:val="center"/>
+              <w:rPr>
+                <w:sz w:val="26"/>
+                <w:szCs w:val="26"/>
+              </w:rPr>
             </w:pPr>
           </w:p>
         </w:tc>
@@ -2448,7 +2778,37 @@
           <w:sz w:val="26"/>
           <w:szCs w:val="26"/>
         </w:rPr>
-        <w:t xml:space="preserve">Phụ lục hợp đồng này là bản không thể tách rời Hợp đồng mua bán giữa ông (bà) </w:t>
+        <w:t>Phụ lục hợp đồng này là bản không thể tách rời Hợp đồng mua bán</w:t>
+      </w:r>
+      <w:r>
+        <w:rPr>
+          <w:sz w:val="26"/>
+          <w:szCs w:val="26"/>
+        </w:rPr>
+        <w:t xml:space="preserve"> số</w:t>
+      </w:r>
+      <w:r>
+        <w:rPr>
+          <w:i/>
+          <w:iCs/>
+          <w:sz w:val="26"/>
+          <w:szCs w:val="26"/>
+        </w:rPr>
+        <w:t xml:space="preserve"> </w:t>
+      </w:r>
+      <w:r>
+        <w:rPr>
+          <w:sz w:val="26"/>
+          <w:szCs w:val="26"/>
+        </w:rPr>
+        <w:t>{{contract_number}}</w:t>
+      </w:r>
+      <w:r>
+        <w:rPr>
+          <w:sz w:val="26"/>
+          <w:szCs w:val="26"/>
+        </w:rPr>
+        <w:t xml:space="preserve"> giữa ông (bà) </w:t>
       </w:r>
       <w:r>
         <w:rPr>
@@ -2476,15 +2836,7 @@
           <w:sz w:val="26"/>
           <w:szCs w:val="26"/>
         </w:rPr>
-        <w:t xml:space="preserve">. Phụ lục này được lập thành 02 bản, mỗi bên giữ </w:t>
-      </w:r>
-      <w:r>
-        <w:rPr>
-          <w:sz w:val="26"/>
-          <w:szCs w:val="26"/>
-        </w:rPr>
-        <w:lastRenderedPageBreak/>
-        <w:t>01 bản có giá trị pháp lý như nhau và có hiệu lực kể từ ngày ký.</w:t>
+        <w:t>. Phụ lục này được lập thành 02 bản, mỗi bên giữ 01 bản có giá trị pháp lý như nhau và có hiệu lực kể từ ngày ký.</w:t>
       </w:r>
       <w:r>
         <w:br/>

</xml_diff>

<commit_message>
commit trước khi update chi tiết vận chuyển
</commit_message>
<xml_diff>
--- a/my_custom_addons/dl_wood_traceability/static/TEMPLATES/TEMPLATE_HD_HSG.docx
+++ b/my_custom_addons/dl_wood_traceability/static/TEMPLATES/TEMPLATE_HD_HSG.docx
@@ -2001,7 +2001,21 @@
           <w:sz w:val="26"/>
           <w:szCs w:val="26"/>
         </w:rPr>
-        <w:t>{{owner_address}}</w:t>
+        <w:t>{{</w:t>
+      </w:r>
+      <w:r>
+        <w:rPr>
+          <w:sz w:val="26"/>
+          <w:szCs w:val="26"/>
+        </w:rPr>
+        <w:t>forest_owner_address</w:t>
+      </w:r>
+      <w:r>
+        <w:rPr>
+          <w:sz w:val="26"/>
+          <w:szCs w:val="26"/>
+        </w:rPr>
+        <w:t>}}</w:t>
       </w:r>
     </w:p>
     <w:p>

</xml_diff>

<commit_message>
fix tạo mới công ty
</commit_message>
<xml_diff>
--- a/my_custom_addons/dl_wood_traceability/static/TEMPLATES/TEMPLATE_HD_HSG.docx
+++ b/my_custom_addons/dl_wood_traceability/static/TEMPLATES/TEMPLATE_HD_HSG.docx
@@ -1833,7 +1833,7 @@
           <w:sz w:val="26"/>
           <w:szCs w:val="26"/>
         </w:rPr>
-        <w:t xml:space="preserve">Hôm nay, </w:t>
+        <w:t>Hôm nay,</w:t>
       </w:r>
       <w:r>
         <w:rPr>
@@ -1842,7 +1842,7 @@
           <w:sz w:val="26"/>
           <w:szCs w:val="26"/>
         </w:rPr>
-        <w:t>, {{vietnamese_x_contract_date}}</w:t>
+        <w:t xml:space="preserve"> {{vietnamese_x_contract_date}}</w:t>
       </w:r>
       <w:r>
         <w:rPr>

</xml_diff>